<commit_message>
Protocolo de retirada: análise v2.1, ponto 1.5 da proposta
Novo ponto 4.4, u): o que o ponto 1.5 exclui (captura de rotina de errantes,
polícia sanitária) e o que deixa dentro sem nomear (DL 314/2003, art. 3.º;
DL 315/2009). Decisões de 14.10.2026: «de rotina» vago, exige critério;
excluir a recolha após agressão (DL 315/2009, art. 14.º) e incluir a
apreensão de perigosos (art. 39.º); questão em aberto aos proponentes sobre
o DL 314/2003, art. 3.º, e os acumuladores; nota de redação sobre «umas e
outras». Recomendação, quadro ponto a ponto e próximos passos ajustados.

Co-Authored-By: Claude Opus 5.5 <noreply@anthropic.com>
Claude-Session: https://claude.ai/code/session_01HVdseQDU3TzmMp7vD8ambZ
</commit_message>
<xml_diff>
--- a/Protocolo de retirada de alojamentos/Analise_Proposta_OMV_ANVETEM_Retirada_e_Socorro_v2.docx
+++ b/Protocolo de retirada de alojamentos/Analise_Proposta_OMV_ANVETEM_Retirada_e_Socorro_v2.docx
@@ -81,7 +81,7 @@
           <w:color w:val="555555"/>
           <w:sz w:val="18"/>
         </w:rPr>
-        <w:t>Documento de trabalho, versão 2, 14.10.2026. Integra as notas manuscritas ao ficheiro anotado «Proposta de Procedimento Integrado_DGAV_OMV_ANVETE_261013_001303.pdf» e os esclarecimentos recebidos em 14.10.2026. Analisa a proposta «Proposta de Procedimento Integrado_DGAV_OMV_ANVETEM_v26_08_2026_signed_signed.pdf».</w:t>
+        <w:t>Documento de trabalho, versão 2.1, 14.10.2026 (2.1: acrescentado o ponto 4.4, u), sobre o ponto 1.5 da proposta). Integra as notas manuscritas ao ficheiro anotado «Proposta de Procedimento Integrado_DGAV_OMV_ANVETE_261013_001303.pdf» e os esclarecimentos recebidos em 14.10.2026. Analisa a proposta «Proposta de Procedimento Integrado_DGAV_OMV_ANVETEM_v26_08_2026_signed_signed.pdf».</w:t>
       </w:r>
     </w:p>
     <w:p>
@@ -1803,7 +1803,7 @@
               <w:rPr>
                 <w:sz w:val="17"/>
               </w:rPr>
-              <w:t>Nomear os diplomas.</w:t>
+              <w:t>Nomear os diplomas; substituir «de rotina» por um critério; clarificar «umas e outras» (ver 4.4, u)).</w:t>
             </w:r>
           </w:p>
         </w:tc>
@@ -5420,7 +5420,7 @@
         <w:t xml:space="preserve">Apreciação. </w:t>
       </w:r>
       <w:r>
-        <w:t>O ponto 1.1 e a tipologia A deixam de fora os riscos higiossanitários e ambientais (ver 4.1) e só indicam o DL 276/2001 como regime de referência. Para alojamentos registados, a base é o art.º 3.º-G (suspensão e encerramento pelo diretor-geral; recolha pelas câmaras), que a proposta só cita numa nota. Faltam também o DL 314/2003 e o DL 315/2009, ambos com regimes próprios de remoção, mandado e destino (ver 4.2, V5 e V7).</w:t>
+        <w:t>O ponto 1.1 e a tipologia A deixam de fora os riscos higiossanitários e ambientais (ver 4.1) e só indicam o DL 276/2001 como regime de referência. Para alojamentos registados, a base é o art.º 3.º-G (suspensão e encerramento pelo diretor-geral; recolha pelas câmaras), que a proposta só cita numa nota. Faltam também o DL 314/2003 e o DL 315/2009, ambos com regimes próprios de remoção, mandado e destino (ver 4.2, V5 e V7). O que fazer com cada um está em u).</w:t>
       </w:r>
     </w:p>
     <w:p>
@@ -5756,6 +5756,131 @@
       </w:r>
       <w:r>
         <w:t>O relatório do ponto 10.2 vai ao médico veterinário municipal e à câmara. Há razões para isso (CRO, recolha pelas câmaras, encargos), mas não sempre nem por inteiro: havendo processo penal, a distribuição tem de respeitar o segredo de justiça e a proteção de dados, e deve ser feita por necessidade. A avaliação anual do ponto 10.4 só junta a DGAV, a OMV e a ANVETEM. Devem participar também a ANMP, as forças de segurança, a ANEPC e representantes das associações.</w:t>
+      </w:r>
+    </w:p>
+    <w:p>
+      <w:pPr>
+        <w:keepNext/>
+        <w:spacing w:before="160" w:after="60"/>
+      </w:pPr>
+      <w:r>
+        <w:rPr>
+          <w:b/>
+          <w:sz w:val="21"/>
+        </w:rPr>
+        <w:t>u) O ponto 1.5: o que exclui e o que deixa dentro</w:t>
+      </w:r>
+    </w:p>
+    <w:p>
+      <w:pPr>
+        <w:spacing w:after="120"/>
+      </w:pPr>
+      <w:r>
+        <w:rPr>
+          <w:b w:val="0"/>
+          <w:i w:val="0"/>
+          <w:sz w:val="21"/>
+        </w:rPr>
+        <w:t>Descrição. O ponto 1.5 é a única norma da proposta que delimita o âmbito pela negativa:</w:t>
+      </w:r>
+    </w:p>
+    <w:p>
+      <w:pPr>
+        <w:spacing w:after="40"/>
+        <w:ind w:left="454" w:right="227"/>
+      </w:pPr>
+      <w:r>
+        <w:rPr>
+          <w:i/>
+          <w:sz w:val="19"/>
+        </w:rPr>
+        <w:t>«1.5 Não é abrangida a recolha ou captura de rotina de animais errantes, regulada por legislação própria, nem a execução de medidas de polícia sanitária determinadas no âmbito dos planos de contingência de doenças de declaração obrigatória, que seguem regime próprio. Concorrendo umas e outras, aplica-se o disposto no ponto 11.3.»</w:t>
+      </w:r>
+    </w:p>
+    <w:p>
+      <w:pPr>
+        <w:spacing w:after="160"/>
+        <w:ind w:left="454"/>
+      </w:pPr>
+      <w:r>
+        <w:rPr>
+          <w:color w:val="555555"/>
+          <w:sz w:val="17"/>
+        </w:rPr>
+        <w:t>ponto 1.5 da proposta OMV/ANVETEM (v3.0, 26.8.2026)</w:t>
+      </w:r>
+    </w:p>
+    <w:p>
+      <w:pPr>
+        <w:spacing w:after="120"/>
+      </w:pPr>
+      <w:r>
+        <w:rPr>
+          <w:b w:val="0"/>
+          <w:i w:val="0"/>
+          <w:sz w:val="21"/>
+        </w:rPr>
+        <w:t>Ficam fora duas coisas: a captura de rotina de errantes, cuja «legislação própria» é o DL 314/2003 (arts. 8.º e 9.º), com a Lei n.º 27/2016 e a Portaria n.º 146/2017; e as medidas de polícia sanitária, isto é, as medidas de autoridade para prevenir e erradicar doenças animais, como o sequestro de 15 dias do animal agressor no CRO previsto para a raiva. Tudo o resto em que participem serviços da DGAV fica dentro, porque o ponto 1.2 abrange «todas as operações» e enumera os diplomas com «designadamente». Ficam assim dentro, sem serem nomeados, a remoção por excesso de animais ou insalubridade (DL 314/2003, art.º 3.º) e todo o DL 315/2009. Nenhum destes dois diplomas é referido na proposta.</w:t>
+      </w:r>
+    </w:p>
+    <w:p>
+      <w:pPr>
+        <w:spacing w:after="120"/>
+      </w:pPr>
+      <w:r>
+        <w:rPr>
+          <w:b/>
+          <w:color w:val="1F3B63"/>
+        </w:rPr>
+        <w:t xml:space="preserve">Apreciação. </w:t>
+      </w:r>
+      <w:r>
+        <w:t>«De rotina» é vago demais para uma norma técnica. Não diz se uma captura grande, uma matilha ou uma colónia em que se detetam animais em sofrimento ficam dentro ou fora. É preciso um critério verificável, por exemplo: «a captura de animais errantes ao abrigo do art.º 8.º do DL 314/2003, salvo quando haja indícios de maus-tratos, de acumulação de animais ou de criação ilegal».</w:t>
+      </w:r>
+    </w:p>
+    <w:p>
+      <w:pPr>
+        <w:spacing w:after="120"/>
+      </w:pPr>
+      <w:r>
+        <w:rPr>
+          <w:b/>
+          <w:color w:val="1F3B63"/>
+        </w:rPr>
+        <w:t xml:space="preserve">Apreciação. </w:t>
+      </w:r>
+      <w:r>
+        <w:t>O DL 315/2009 deve ser tratado em duas partes. A recolha do animal que agrediu uma pessoa (art.º 14.º) é um procedimento municipal corrente, dirigido pelo médico veterinário municipal, que decide o destino (art.º 15.º); tem a mesma natureza da captura de errantes e deve ser excluída expressamente no ponto 1.5. A apreensão de animais perigosos ou potencialmente perigosos (art.º 39.º), quando haja maus-tratos, lutas ou criação ilegal, deve ficar dentro e ser nomeada no ponto 1.2 e na tipologia A.</w:t>
+      </w:r>
+    </w:p>
+    <w:p>
+      <w:pPr>
+        <w:spacing w:after="120"/>
+      </w:pPr>
+      <w:r>
+        <w:rPr>
+          <w:b/>
+          <w:color w:val="1F3B63"/>
+        </w:rPr>
+        <w:t xml:space="preserve">Questão em aberto para os proponentes. </w:t>
+      </w:r>
+      <w:r>
+        <w:t>Qual o enquadramento proposto para a remoção de animais por excesso ou por insalubridade (DL 314/2003, art.º 3.º, n.ºs 5 e 6), decidida pela câmara após vistoria conjunta do delegado de saúde e do médico veterinário municipal, e para os casos de acumulação de animais? A proposta não os nomeia nem os exclui, e são precisamente os casos em que a liderança não é da DGAV e em que a dimensão social e de saúde pesa mais (ver j)).</w:t>
+      </w:r>
+    </w:p>
+    <w:p>
+      <w:pPr>
+        <w:spacing w:after="120"/>
+      </w:pPr>
+      <w:r>
+        <w:rPr>
+          <w:b/>
+          <w:color w:val="1F3B63"/>
+        </w:rPr>
+        <w:t xml:space="preserve">Nota de redação. </w:t>
+      </w:r>
+      <w:r>
+        <w:t>A frase final do ponto 1.5 é ambígua. «Concorrendo umas e outras» pode referir as duas exclusões ou só a polícia sanitária. O ponto 11.3, para que remete, só regula a concorrência com medidas de polícia sanitária. Pede-se aos proponentes que clarifiquem a que se refere «umas e outras».</w:t>
       </w:r>
     </w:p>
     <w:p>
@@ -6699,7 +6824,7 @@
         <w:rPr>
           <w:sz w:val="21"/>
         </w:rPr>
-        <w:t>incluir os riscos higiossanitários e ambientais e indicar, na tipologia A, o art.º 3.º-G do DL 276/2001, o DL 314/2003 e o DL 315/2009 (notas 2, 4, 8 e 9).</w:t>
+        <w:t>incluir os riscos higiossanitários e ambientais e indicar, na tipologia A, o art.º 3.º-G do DL 276/2001 e o art.º 39.º do DL 315/2009 (notas 2, 4, 8 e 9; ver 4.4, o) e u)).</w:t>
       </w:r>
     </w:p>
     <w:p>
@@ -6712,13 +6837,13 @@
         <w:rPr>
           <w:b/>
         </w:rPr>
-        <w:t xml:space="preserve">R15. Responsável clínico com CAMV: </w:t>
+        <w:t xml:space="preserve">R15. Ponto 1.5: </w:t>
       </w:r>
       <w:r>
         <w:rPr>
           <w:sz w:val="21"/>
         </w:rPr>
-        <w:t>designado por quem tem o título da operação, com CAMV próprio ou protocolo com CAMV ou CRO equipado, e com substituto (notas 6, 14 e 31).</w:t>
+        <w:t>substituir «de rotina» por um critério verificável; excluir expressamente a recolha após agressão (DL 315/2009, art.º 14.º); pedir aos proponentes o enquadramento da remoção por excesso ou insalubridade (DL 314/2003, art.º 3.º) e dos acumuladores; pedir clarificação de «umas e outras» (4.4, u)).</w:t>
       </w:r>
     </w:p>
     <w:p>
@@ -6731,13 +6856,13 @@
         <w:rPr>
           <w:b/>
         </w:rPr>
-        <w:t xml:space="preserve">R16. Médico veterinário do município: </w:t>
+        <w:t xml:space="preserve">R16. Responsável clínico com CAMV: </w:t>
       </w:r>
       <w:r>
         <w:rPr>
           <w:sz w:val="21"/>
         </w:rPr>
-        <w:t>definir «convocação»; convocar o MVM ou, na falta, o médico veterinário contratado pelo município, antes de recorrer ao concelho vizinho (notas 23, 26 e 27).</w:t>
+        <w:t>designado por quem tem o título da operação, com CAMV próprio ou protocolo com CAMV ou CRO equipado, e com substituto (notas 6, 14 e 31).</w:t>
       </w:r>
     </w:p>
     <w:p>
@@ -6750,13 +6875,13 @@
         <w:rPr>
           <w:b/>
         </w:rPr>
-        <w:t xml:space="preserve">R17. Posto de triagem e equipa: </w:t>
+        <w:t xml:space="preserve">R17. Médico veterinário do município: </w:t>
       </w:r>
       <w:r>
         <w:rPr>
           <w:sz w:val="21"/>
         </w:rPr>
-        <w:t>condições de bem-estar no posto; enfermeiros ou auxiliares veterinários no dimensionamento (notas 28 e 29).</w:t>
+        <w:t>definir «convocação»; convocar o MVM ou, na falta, o médico veterinário contratado pelo município, antes de recorrer ao concelho vizinho (notas 23, 26 e 27).</w:t>
       </w:r>
     </w:p>
     <w:p>
@@ -6769,13 +6894,13 @@
         <w:rPr>
           <w:b/>
         </w:rPr>
-        <w:t xml:space="preserve">R18. Cadáveres: </w:t>
+        <w:t xml:space="preserve">R18. Posto de triagem e equipa: </w:t>
       </w:r>
       <w:r>
         <w:rPr>
           <w:sz w:val="21"/>
         </w:rPr>
-        <w:t>destino dos cadáveres de animais de companhia e exame ou necropsia prévia quando há processo penal (nota 33).</w:t>
+        <w:t>condições de bem-estar no posto; enfermeiros ou auxiliares veterinários no dimensionamento (notas 28 e 29).</w:t>
       </w:r>
     </w:p>
     <w:p>
@@ -6788,13 +6913,13 @@
         <w:rPr>
           <w:b/>
         </w:rPr>
-        <w:t xml:space="preserve">R19. Transporte: </w:t>
+        <w:t xml:space="preserve">R19. Cadáveres: </w:t>
       </w:r>
       <w:r>
         <w:rPr>
           <w:sz w:val="21"/>
         </w:rPr>
-        <w:t>para animais de companhia, aplicar o n.º 1 do art.º 10.º do DL 276/2001 e não exigir autorização de transportador (nota 38).</w:t>
+        <w:t>destino dos cadáveres de animais de companhia e exame ou necropsia prévia quando há processo penal (nota 33).</w:t>
       </w:r>
     </w:p>
     <w:p>
@@ -6807,13 +6932,13 @@
         <w:rPr>
           <w:b/>
         </w:rPr>
-        <w:t xml:space="preserve">R20. Bolsa de entidades: procedimento e custos: </w:t>
+        <w:t xml:space="preserve">R20. Transporte: </w:t>
       </w:r>
       <w:r>
         <w:rPr>
           <w:sz w:val="21"/>
         </w:rPr>
-        <w:t>quem pede, quem verifica, prazos e recurso; um só termo (suspensão ou exclusão); seguro com fonte de financiamento (notas 37, 39 e 40).</w:t>
+        <w:t>para animais de companhia, aplicar o n.º 1 do art.º 10.º do DL 276/2001 e não exigir autorização de transportador (nota 38).</w:t>
       </w:r>
     </w:p>
     <w:p>
@@ -6826,13 +6951,13 @@
         <w:rPr>
           <w:b/>
         </w:rPr>
-        <w:t xml:space="preserve">R21. Relatório e avaliação: </w:t>
+        <w:t xml:space="preserve">R21. Bolsa de entidades: procedimento e custos: </w:t>
       </w:r>
       <w:r>
         <w:rPr>
           <w:sz w:val="21"/>
         </w:rPr>
-        <w:t>distribuição por necessidade, com respeito pelo segredo de justiça; avaliação anual também com ANMP, forças de segurança, ANEPC e associações (notas 41 e 43).</w:t>
+        <w:t>quem pede, quem verifica, prazos e recurso; um só termo (suspensão ou exclusão); seguro com fonte de financiamento (notas 37, 39 e 40).</w:t>
       </w:r>
     </w:p>
     <w:p>
@@ -6845,7 +6970,26 @@
         <w:rPr>
           <w:b/>
         </w:rPr>
-        <w:t xml:space="preserve">R22. Levar ao RGAC as necessidades A1 a A10: </w:t>
+        <w:t xml:space="preserve">R22. Relatório e avaliação: </w:t>
+      </w:r>
+      <w:r>
+        <w:rPr>
+          <w:sz w:val="21"/>
+        </w:rPr>
+        <w:t>distribuição por necessidade, com respeito pelo segredo de justiça; avaliação anual também com ANMP, forças de segurança, ANEPC e associações (notas 41 e 43).</w:t>
+      </w:r>
+    </w:p>
+    <w:p>
+      <w:pPr>
+        <w:pStyle w:val="ListBullet"/>
+        <w:spacing w:after="60"/>
+        <w:jc w:val="both"/>
+      </w:pPr>
+      <w:r>
+        <w:rPr>
+          <w:b/>
+        </w:rPr>
+        <w:t xml:space="preserve">R23. Levar ao RGAC as necessidades A1 a A10: </w:t>
       </w:r>
       <w:r>
         <w:rPr>
@@ -8484,7 +8628,7 @@
         <w:rPr>
           <w:b/>
         </w:rPr>
-        <w:t xml:space="preserve">R23. Reescrever a tipologia D: </w:t>
+        <w:t xml:space="preserve">R24. Reescrever a tipologia D: </w:t>
       </w:r>
       <w:r>
         <w:rPr>
@@ -8503,7 +8647,7 @@
         <w:rPr>
           <w:b/>
         </w:rPr>
-        <w:t xml:space="preserve">R24. Despacho interno de designação: </w:t>
+        <w:t xml:space="preserve">R25. Despacho interno de designação: </w:t>
       </w:r>
       <w:r>
         <w:rPr>
@@ -8522,7 +8666,7 @@
         <w:rPr>
           <w:b/>
         </w:rPr>
-        <w:t xml:space="preserve">R25. Proposta de critérios técnicos: </w:t>
+        <w:t xml:space="preserve">R26. Proposta de critérios técnicos: </w:t>
       </w:r>
       <w:r>
         <w:rPr>
@@ -8541,7 +8685,7 @@
         <w:rPr>
           <w:b/>
         </w:rPr>
-        <w:t xml:space="preserve">R26. Protocolo de reunificação no SIAC: </w:t>
+        <w:t xml:space="preserve">R27. Protocolo de reunificação no SIAC: </w:t>
       </w:r>
       <w:r>
         <w:rPr>
@@ -8560,7 +8704,7 @@
         <w:rPr>
           <w:b/>
         </w:rPr>
-        <w:t xml:space="preserve">R27. Partilha da lista de alojamentos: </w:t>
+        <w:t xml:space="preserve">R28. Partilha da lista de alojamentos: </w:t>
       </w:r>
       <w:r>
         <w:rPr>
@@ -8579,7 +8723,7 @@
         <w:rPr>
           <w:b/>
         </w:rPr>
-        <w:t xml:space="preserve">R28. Orientação técnica sobre eutanásia no terreno. </w:t>
+        <w:t xml:space="preserve">R29. Orientação técnica sobre eutanásia no terreno. </w:t>
       </w:r>
       <w:r>
         <w:rPr>
@@ -8597,7 +8741,7 @@
         <w:rPr>
           <w:b/>
         </w:rPr>
-        <w:t xml:space="preserve">R29. Protocolo com a OMV: </w:t>
+        <w:t xml:space="preserve">R30. Protocolo com a OMV: </w:t>
       </w:r>
       <w:r>
         <w:rPr>
@@ -8616,7 +8760,7 @@
         <w:rPr>
           <w:b/>
         </w:rPr>
-        <w:t xml:space="preserve">R30. Cláusula de passagem do socorro à retirada. </w:t>
+        <w:t xml:space="preserve">R31. Cláusula de passagem do socorro à retirada. </w:t>
       </w:r>
       <w:r>
         <w:rPr>
@@ -8634,7 +8778,7 @@
         <w:rPr>
           <w:b/>
         </w:rPr>
-        <w:t xml:space="preserve">R31. Organizações de voluntariado de proteção civil: </w:t>
+        <w:t xml:space="preserve">R32. Organizações de voluntariado de proteção civil: </w:t>
       </w:r>
       <w:r>
         <w:rPr>
@@ -8653,7 +8797,7 @@
         <w:rPr>
           <w:b/>
         </w:rPr>
-        <w:t xml:space="preserve">R32. Propor à ANEPC a atualização da Portaria n.º 91/2017: </w:t>
+        <w:t xml:space="preserve">R33. Propor à ANEPC a atualização da Portaria n.º 91/2017: </w:t>
       </w:r>
       <w:r>
         <w:rPr>
@@ -8672,7 +8816,7 @@
         <w:rPr>
           <w:b/>
         </w:rPr>
-        <w:t xml:space="preserve">R33. Retirar do módulo B o mandado prévio e a observação antes da saída: </w:t>
+        <w:t xml:space="preserve">R34. Retirar do módulo B o mandado prévio e a observação antes da saída: </w:t>
       </w:r>
       <w:r>
         <w:rPr>
@@ -8691,7 +8835,7 @@
         <w:rPr>
           <w:b/>
         </w:rPr>
-        <w:t xml:space="preserve">R34. Retirar a comunicação prévia e o relatório à comissão municipal: </w:t>
+        <w:t xml:space="preserve">R35. Retirar a comunicação prévia e o relatório à comissão municipal: </w:t>
       </w:r>
       <w:r>
         <w:rPr>
@@ -8710,7 +8854,7 @@
         <w:rPr>
           <w:b/>
         </w:rPr>
-        <w:t xml:space="preserve">R35. Retirar números variáveis e esclarecer a comissão técnica da OMV: </w:t>
+        <w:t xml:space="preserve">R36. Retirar números variáveis e esclarecer a comissão técnica da OMV: </w:t>
       </w:r>
       <w:r>
         <w:rPr>
@@ -8729,7 +8873,7 @@
         <w:rPr>
           <w:b/>
         </w:rPr>
-        <w:t xml:space="preserve">R36. Levar ao RGAC as necessidades B1, B2, B4 e B6: </w:t>
+        <w:t xml:space="preserve">R37. Levar ao RGAC as necessidades B1, B2, B4 e B6: </w:t>
       </w:r>
       <w:r>
         <w:rPr>
@@ -9457,7 +9601,7 @@
         <w:rPr>
           <w:sz w:val="21"/>
         </w:rPr>
-        <w:t>Resposta da DGAV à OMV e à ANVETEM, a aceitar o grupo de trabalho e a apresentar a estrutura de 7.1 e as recomendações R1 a R36 como base de revisão.</w:t>
+        <w:t>Resposta da DGAV à OMV e à ANVETEM, a aceitar o grupo de trabalho e a apresentar a estrutura de 7.1 e as recomendações R1 a R37 como base de revisão.</w:t>
       </w:r>
     </w:p>
     <w:p>
@@ -9470,7 +9614,7 @@
         <w:rPr>
           <w:sz w:val="21"/>
         </w:rPr>
-        <w:t>Designação, em despacho autónomo e sem esperar pelo grupo de trabalho, dos representantes da DGAV previstos na Lei n.º 38/2026 (R24).</w:t>
+        <w:t>Designação, em despacho autónomo e sem esperar pelo grupo de trabalho, dos representantes da DGAV previstos na Lei n.º 38/2026 (R25).</w:t>
       </w:r>
     </w:p>
     <w:p>
@@ -9483,7 +9627,7 @@
         <w:rPr>
           <w:sz w:val="21"/>
         </w:rPr>
-        <w:t>Medidas imediatas que dependem só da DGAV: estado «sob apreensão ou custódia» no SIAC (R8); orientação sobre a presunção de 15 dias (R9); partilha da lista de alojamentos com a proteção civil (R27).</w:t>
+        <w:t>Medidas imediatas que dependem só da DGAV: estado «sob apreensão ou custódia» no SIAC (R8); orientação sobre a presunção de 15 dias (R9); partilha da lista de alojamentos com a proteção civil (R28).</w:t>
       </w:r>
     </w:p>
     <w:p>
@@ -9496,7 +9640,20 @@
         <w:rPr>
           <w:sz w:val="21"/>
         </w:rPr>
-        <w:t>Proposta à ANEPC sobre as organizações de voluntariado de proteção civil (R32).</w:t>
+        <w:t>Proposta à ANEPC sobre as organizações de voluntariado de proteção civil (R33).</w:t>
+      </w:r>
+    </w:p>
+    <w:p>
+      <w:pPr>
+        <w:pStyle w:val="ListBullet"/>
+        <w:spacing w:after="60"/>
+        <w:jc w:val="both"/>
+      </w:pPr>
+      <w:r>
+        <w:rPr>
+          <w:sz w:val="21"/>
+        </w:rPr>
+        <w:t>Questões a colocar aos proponentes: o enquadramento da remoção por excesso ou insalubridade (DL 314/2003, art.º 3.º) e dos casos de acumulação de animais; o sentido de «umas e outras» no ponto 1.5 (R15).</w:t>
       </w:r>
     </w:p>
     <w:p>
@@ -10094,7 +10251,7 @@
               <w:rPr>
                 <w:sz w:val="16"/>
               </w:rPr>
-              <w:t>Errantes: legislação própria.</w:t>
+              <w:t>Exclui a captura de rotina de errantes e a polícia sanitária.</w:t>
             </w:r>
           </w:p>
         </w:tc>
@@ -10112,7 +10269,7 @@
               <w:rPr>
                 <w:sz w:val="16"/>
               </w:rPr>
-              <w:t>Não nomeia os diplomas.</w:t>
+              <w:t>Não nomeia os diplomas; «de rotina» vago; deixa dentro, sem os nomear, o DL 314/2003, art.º 3.º, e o DL 315/2009; «umas e outras» ambíguo.</w:t>
             </w:r>
           </w:p>
         </w:tc>
@@ -10130,7 +10287,7 @@
               <w:rPr>
                 <w:sz w:val="16"/>
               </w:rPr>
-              <w:t>DL 314/2003, Lei 27/2016, Portaria 146/2017 (3.3).</w:t>
+              <w:t>Critério; excluir DL 315/2009, art.º 14.º; questão em aberto sobre DL 314/2003, art.º 3.º, e acumuladores (4.4, u)).</w:t>
             </w:r>
           </w:p>
         </w:tc>
@@ -14845,6 +15002,62 @@
                 <w:sz w:val="17"/>
               </w:rPr>
               <w:t>5.3; 5.4, l)</w:t>
+            </w:r>
+          </w:p>
+        </w:tc>
+      </w:tr>
+      <w:tr>
+        <w:tc>
+          <w:tcPr>
+            <w:tcW w:type="dxa" w:w="1247"/>
+          </w:tcPr>
+          <w:p>
+            <w:pPr>
+              <w:spacing w:after="40"/>
+              <w:jc w:val="left"/>
+            </w:pPr>
+            <w:r/>
+            <w:r>
+              <w:rPr>
+                <w:sz w:val="17"/>
+              </w:rPr>
+              <w:t>Decisões de 14.10.2026</w:t>
+            </w:r>
+          </w:p>
+        </w:tc>
+        <w:tc>
+          <w:tcPr>
+            <w:tcW w:type="dxa" w:w="4706"/>
+          </w:tcPr>
+          <w:p>
+            <w:pPr>
+              <w:spacing w:after="40"/>
+              <w:jc w:val="left"/>
+            </w:pPr>
+            <w:r/>
+            <w:r>
+              <w:rPr>
+                <w:sz w:val="17"/>
+              </w:rPr>
+              <w:t>Ponto 1.5: «de rotina», DL 315/2009, DL 314/2003 e acumuladores, «umas e outras»</w:t>
+            </w:r>
+          </w:p>
+        </w:tc>
+        <w:tc>
+          <w:tcPr>
+            <w:tcW w:type="dxa" w:w="3118"/>
+          </w:tcPr>
+          <w:p>
+            <w:pPr>
+              <w:spacing w:after="40"/>
+              <w:jc w:val="left"/>
+            </w:pPr>
+            <w:r/>
+            <w:r>
+              <w:rPr>
+                <w:sz w:val="17"/>
+              </w:rPr>
+              <w:t>4.4, u); 4.6; 7.2</w:t>
             </w:r>
           </w:p>
         </w:tc>

</xml_diff>